<commit_message>
ECON 5021: simplify replication proposal docx
Co-Authored-By: Claude Opus 5.5 <noreply@anthropic.com>
</commit_message>
<xml_diff>
--- a/SS1-ECON5021-AdvEconometrics1/Replication_Project/Replication_Proposal_LLM_Labor_Market_Signals.docx
+++ b/SS1-ECON5021-AdvEconometrics1/Replication_Project/Replication_Proposal_LLM_Labor_Market_Signals.docx
@@ -31,20 +31,17 @@
       </w:r>
     </w:p>
     <w:p>
-      <w:pPr>
-        <w:ind w:firstLine="720"/>
-      </w:pPr>
       <w:r>
         <w:rPr>
           <w:b/>
         </w:rPr>
-        <w:t xml:space="preserve">1. Article. </w:t>
+        <w:t xml:space="preserve">Paper: </w:t>
       </w:r>
       <w:r>
         <w:rPr>
           <w:i w:val="0"/>
         </w:rPr>
-        <w:t xml:space="preserve">Abbas Nejad, Kian, Giuseppe Musillo, Till Wicker, and Niccolò Zaccaria. “Labor Market Signals: The Role of Large Language Models.” </w:t>
+        <w:t xml:space="preserve">“Labor Market Signals: The Role of Large Language Models,” by Kian Abbas Nejad, Giuseppe Musillo, Till Wicker, and Niccolò Zaccaria. </w:t>
       </w:r>
       <w:r>
         <w:rPr>
@@ -56,104 +53,85 @@
         <w:rPr>
           <w:i w:val="0"/>
         </w:rPr>
-        <w:t>, published online October 2026, https://doi.org/10.1086/744669.</w:t>
+        <w:t>, published online October 2026. https://doi.org/10.1086/744669</w:t>
       </w:r>
     </w:p>
     <w:p>
-      <w:pPr>
-        <w:ind w:firstLine="720"/>
-      </w:pPr>
       <w:r>
         <w:rPr>
           <w:b/>
         </w:rPr>
-        <w:t xml:space="preserve">2. Replication package. </w:t>
+        <w:t xml:space="preserve">Replication package: </w:t>
       </w:r>
       <w:r>
         <w:rPr>
           <w:i w:val="0"/>
         </w:rPr>
-        <w:t>The package is on Harvard Dataverse at https://doi.org/10.7910/DVN/LPIREO. I downloaded it (ChatGPT_ReplicationPackage.zip, 2.8 MB) and confirmed that it contains the final analysis data (Data/Experiment_1/2_Final/FinalData_forAnalysis.dta and the Experiment 2 .dta files), the cleaning code, and the analysis code that produces every regression table. The only data withheld, for IRB and GDPR reasons, are the raw cover-letter texts and browser histories. Their numerical evaluations are included, so none of the tables I plan to replicate depend on them.</w:t>
+        <w:t>https://doi.org/10.7910/DVN/LPIREO (Harvard Dataverse). I downloaded it and confirmed it includes the analysis data (.dta) and the code for every regression table. Only the raw cover-letter texts and browser histories are withheld (IRB/GDPR), and none of the tables below depend on them.</w:t>
       </w:r>
     </w:p>
     <w:p>
-      <w:pPr>
-        <w:ind w:firstLine="720"/>
-      </w:pPr>
       <w:r>
         <w:rPr>
           <w:b/>
         </w:rPr>
-        <w:t xml:space="preserve">3. Programming language. </w:t>
+        <w:t xml:space="preserve">Language: </w:t>
       </w:r>
       <w:r>
         <w:rPr>
           <w:i w:val="0"/>
         </w:rPr>
-        <w:t>The regression tables are produced in Stata (Code/2_Analysis/1_Main_Analysis_code.do and 2_App_Analysis_code.do, run through 0MasterFile.do, using reghdfe, estout, and iebaltab). The structural model is in MATLAB, and a few text-analysis figures use Python. My replication will be done entirely in R.</w:t>
+        <w:t>Stata (tables), with MATLAB for the structural model. My replication will be in R.</w:t>
       </w:r>
     </w:p>
     <w:p>
-      <w:pPr>
-        <w:ind w:firstLine="720"/>
-      </w:pPr>
       <w:r>
         <w:rPr>
           <w:b/>
         </w:rPr>
-        <w:t xml:space="preserve">4. Research question. </w:t>
+        <w:t xml:space="preserve">Research question: </w:t>
       </w:r>
       <w:r>
         <w:rPr>
           <w:i w:val="0"/>
         </w:rPr>
-        <w:t>The authors are trying to understand the effect of job applicants’ access to a large language model (ChatGPT) on the quality of their cover letters and on how recruiters evaluate them, and therefore whether a cover letter still works as a signal of applicant quality once writing becomes nearly free.</w:t>
+        <w:t>The effect of job applicants’ access to ChatGPT on the quality of their cover letters and how recruiters rate them, i.e., whether a cover letter still signals applicant quality once writing is nearly free.</w:t>
       </w:r>
     </w:p>
     <w:p>
-      <w:pPr>
-        <w:ind w:firstLine="720"/>
-      </w:pPr>
       <w:r>
         <w:rPr>
           <w:b/>
         </w:rPr>
-        <w:t xml:space="preserve">5. Why I chose this paper. </w:t>
+        <w:t xml:space="preserve">Why this paper: </w:t>
       </w:r>
     </w:p>
-    <w:p/>
     <w:p>
-      <w:pPr>
-        <w:ind w:firstLine="720"/>
-      </w:pPr>
       <w:r>
         <w:rPr>
           <w:b/>
         </w:rPr>
-        <w:t xml:space="preserve">6. Summary statistics to replicate. </w:t>
+        <w:t xml:space="preserve">Summary statistics: </w:t>
       </w:r>
       <w:r>
         <w:rPr>
           <w:i w:val="0"/>
         </w:rPr>
-        <w:t>Online Appendix Table A1, “Balance Table: Demographics,” all columns. The table reports the means of applicant characteristics (Dutch, GPA, English, MSc, age, economics or business degree, Tilburg University, and female) for the control and ChatGPT-treatment groups, along with the test of differences between them. It describes the sample and checks that randomization worked.</w:t>
+        <w:t>Online Appendix Table A1, “Balance Table: Demographics,” all columns (applicant characteristics by control and ChatGPT groups, with tests of differences).</w:t>
       </w:r>
     </w:p>
     <w:p>
-      <w:pPr>
-        <w:ind w:firstLine="720"/>
-      </w:pPr>
       <w:r>
         <w:rPr>
           <w:b/>
         </w:rPr>
-        <w:t xml:space="preserve">7. Main OLS result to replicate. </w:t>
+        <w:t xml:space="preserve">Main OLS result: </w:t>
       </w:r>
       <w:r>
         <w:rPr>
           <w:i w:val="0"/>
         </w:rPr>
-        <w:t>Table 1, “Effect of ChatGPT on Cover Letter,” columns (1) through (6). These are OLS regressions of standardized recruiter scores (the overall cover-letter score in column 1, then layout, introduction, experience, motivation, and closing) on the ChatGPT treatment dummy. They control for CV score, GPA, MSc status, age, and gender, include recruiter-by-firm and school fixed effects, and cluster standard errors by applicant. The headline estimate in column (1) is a 0.222 standard-deviation increase in the overall cover-letter score (SE 0.117, N = 274), which directly answers the research question in (4). Columns (7) and (8) are ordered logit and logit models, so I will focus on columns (1) through (6).</w:t>
+        <w:t>Table 1, “Effect of ChatGPT on Cover Letter,” columns (1)–(6). Standardized recruiter scores are regressed on the ChatGPT treatment dummy with controls, recruiter-by-firm and school fixed effects, and standard errors clustered by applicant. Column (1): 0.222 SD increase in the overall score (SE 0.117, N = 274).</w:t>
       </w:r>
     </w:p>
     <w:sectPr>
@@ -550,7 +528,7 @@
     <w:qFormat/>
     <w:rsid w:val="00FC693F"/>
     <w:pPr>
-      <w:spacing w:line="480" w:lineRule="auto" w:before="0" w:after="0"/>
+      <w:spacing w:line="360" w:lineRule="auto" w:before="0" w:after="0"/>
     </w:pPr>
     <w:rPr>
       <w:rFonts w:ascii="Times New Roman" w:hAnsi="Times New Roman" w:eastAsia="Times New Roman"/>

</xml_diff>